<commit_message>
Add DISCLOSURES section (Extreme Networks conflict statement)
</commit_message>
<xml_diff>
--- a/publication/cardiac_imaging_access.docx
+++ b/publication/cardiac_imaging_access.docx
@@ -1015,6 +1015,28 @@
       <w:r>
         <w:rPr>
           <w:b/>
+          <w:rFonts w:ascii="Times New Roman" w:hAnsi="Times New Roman"/>
+          <w:sz w:val="22"/>
+        </w:rPr>
+        <w:t>DISCLOSURES</w:t>
+      </w:r>
+    </w:p>
+    <w:p>
+      <w:r>
+        <w:rPr>
+          <w:rFonts w:ascii="Times New Roman" w:hAnsi="Times New Roman"/>
+          <w:sz w:val="22"/>
+        </w:rPr>
+        <w:t xml:space="preserve">Abdul Razak is employed by Extreme Networks. This work was conducted independently and is unrelated to Extreme Networks. No Extreme Networks data, resources, funding, or confidential information were used.</w:t>
+      </w:r>
+    </w:p>
+    <w:p>
+      <w:pPr>
+        <w:spacing w:before="240" w:after="120"/>
+      </w:pPr>
+      <w:r>
+        <w:rPr>
+          <w:b/>
           <w:sz w:val="22"/>
         </w:rPr>
         <w:t>DATA AVAILABILITY</w:t>

</xml_diff>